<commit_message>
Polish document: add metadata frontmatter, format headings, formal References section; regenerate DOCX\n\nCo-authored-by: Copilot <223556219+Copilot@users.noreply.github.com>
</commit_message>
<xml_diff>
--- a/OWR _ConsTec _Strategy.docx
+++ b/OWR _ConsTec _Strategy.docx
@@ -4,32 +4,60 @@
   <w:body>
     <w:p>
       <w:r>
-        <w:t>CONSERVATION TECHNOLOGY STRATEGY</w:t>
+        <w:t>---</w:t>
       </w:r>
     </w:p>
     <w:p>
       <w:r>
-        <w:t>OKAPI WILDLIFE RESERVE (OWR) — ITURI REGION, DEMOCRATIC REPUBLIC OF CONGO</w:t>
+        <w:t>Title: OWR Conservation Technology Strategy</w:t>
       </w:r>
     </w:p>
     <w:p>
       <w:r>
-        <w:t>Organization: Wildlife Conservation Society (WCS)</w:t>
+        <w:t>Subtitle: Okapi Wildlife Reserve — Ituri Region, Democratic Republic of the Congo</w:t>
       </w:r>
     </w:p>
     <w:p>
       <w:r>
-        <w:t>Target Site: Okapi Wildlife Reserve (OWR)</w:t>
+        <w:t>Author: Wildlife Conservation Society (WCS) — Conservation Technology Unit</w:t>
       </w:r>
     </w:p>
     <w:p>
       <w:r>
-        <w:t>Document Scope: Technology Strategy &amp; Data Management</w:t>
+        <w:t>Prepared-by: WCS Conservation Tech &amp; OWR CCOPS</w:t>
       </w:r>
     </w:p>
     <w:p>
       <w:r>
-        <w:t>Implementation Period: 2026 – 2030</w:t>
+        <w:t>Contact: conservationtech@wcs.org</w:t>
+      </w:r>
+    </w:p>
+    <w:p>
+      <w:r>
+        <w:t>Date: 2026-08-15</w:t>
+      </w:r>
+    </w:p>
+    <w:p>
+      <w:r>
+        <w:t>Version: 1.0</w:t>
+      </w:r>
+    </w:p>
+    <w:p>
+      <w:r>
+        <w:t>Keywords: conservation technology, law enforcement monitoring, ecological monitoring, data management</w:t>
+      </w:r>
+    </w:p>
+    <w:p>
+      <w:r>
+        <w:t>---</w:t>
+      </w:r>
+    </w:p>
+    <w:p>
+      <w:pPr>
+        <w:pStyle w:val="Heading1"/>
+      </w:pPr>
+      <w:r>
+        <w:t>OWR Conservation Technology Strategy (2026–2030)</w:t>
       </w:r>
     </w:p>
     <w:p>
@@ -813,48 +841,141 @@
       </w:r>
     </w:p>
     <w:p>
+      <w:pPr>
+        <w:pStyle w:val="Heading2"/>
+      </w:pPr>
       <w:r>
-        <w:t>---</w:t>
+        <w:t>References</w:t>
       </w:r>
     </w:p>
     <w:p>
       <w:r>
-        <w:t>References &amp; Resource Directory (original doc links retained)</w:t>
+        <w:t>1. WCS Impact Dashboards — Wildlife Conservation Society. https://impact.wcs.org/en-us/Dashboards</w:t>
       </w:r>
     </w:p>
     <w:p>
       <w:r>
-        <w:t>- WCS Impact Dashboards: https://impact.wcs.org/en-us/Dashboards</w:t>
+        <w:t>2. SMART Conservation Tools — SMART Partnership. https://www.smartconservationtools.org</w:t>
       </w:r>
     </w:p>
     <w:p>
       <w:r>
-        <w:t>- SMART Partnership &amp; Tools: https://www.smartconservationtools.org</w:t>
+        <w:t>3. EarthRanger — Vulcan Inc. / EarthRanger Platform. https://www.earthranger.com</w:t>
       </w:r>
     </w:p>
     <w:p>
       <w:r>
-        <w:t>- EarthRanger Protected Area Management: https://www.earthranger.com</w:t>
+        <w:t>4. Wildlife Insights — Smithsonian, Microsoft &amp; partners (AI camera-trap platform). https://www.wildlifeinsights.org</w:t>
       </w:r>
     </w:p>
     <w:p>
       <w:r>
-        <w:t>- Wildlife Insights AI Camera Trapping: https://www.wildlifeinsights.org</w:t>
+        <w:t>5. Global Forest Watch — World Resources Institute (forest monitoring &amp; alerts). https://www.globalforestwatch.org</w:t>
       </w:r>
     </w:p>
     <w:p>
       <w:r>
-        <w:t>- Global Forest Watch Canopy Monitoring: https://www.globalforestwatch.org</w:t>
+        <w:t>6. CIEEM — Conservation Technology overview (analysis &amp; sector commentary). https://cieem.net/conservation-technology-a-game-changer-rewilding-tech/</w:t>
       </w:r>
     </w:p>
     <w:p>
       <w:r>
-        <w:t>- CIEEM Conservation Technology Review: https://cieem.net/conservation-technology-a-game-changer-rewilding-tech/</w:t>
+        <w:t>7. WILDLABS — State of Conservation Technology (community hub &amp; syntheses). https://wildlabs.net/state-of-conservation-technology</w:t>
       </w:r>
     </w:p>
     <w:p>
       <w:r>
-        <w:t>- WILDLABS State of Conservation Tech: https://wildlabs.net/state-of-conservation-technology</w:t>
+        <w:t>8. CyberTracker — Field data collection for non-literate trackers. https://www.cybertracker.org</w:t>
+      </w:r>
+    </w:p>
+    <w:p>
+      <w:r>
+        <w:t>9. KoboToolbox — Mobile data collection for field and humanitarian contexts. https://www.kobotoolbox.org</w:t>
+      </w:r>
+    </w:p>
+    <w:p>
+      <w:r>
+        <w:t>10. OpenFn — Integration middleware for humanitarian &amp; conservation data. https://openfn.org</w:t>
+      </w:r>
+    </w:p>
+    <w:p>
+      <w:r>
+        <w:t>11. AudioMoth — Low-cost acoustic recorder project. https://audiomoth.github.io</w:t>
+      </w:r>
+    </w:p>
+    <w:p>
+      <w:r>
+        <w:t>12. Wildlife Acoustics — Commercial bioacoustics solutions. https://www.wildlifeacoustics.com</w:t>
+      </w:r>
+    </w:p>
+    <w:p>
+      <w:r>
+        <w:t>13. GBIF — Global Biodiversity Information Facility (occurrence data). https://www.gbif.org</w:t>
+      </w:r>
+    </w:p>
+    <w:p>
+      <w:r>
+        <w:t>14. Movebank — Animal movement data repository and tools. https://www.movebank.org</w:t>
+      </w:r>
+    </w:p>
+    <w:p>
+      <w:r>
+        <w:t>15. TDWG — Biodiversity Information Standards (data &amp; metadata standards). https://www.tdwg.org</w:t>
+      </w:r>
+    </w:p>
+    <w:p>
+      <w:r>
+        <w:t>16. Google Earth Engine — Planetary-scale geospatial analysis. https://earthengine.google.com</w:t>
+      </w:r>
+    </w:p>
+    <w:p>
+      <w:r>
+        <w:t>17. ArcGIS / StoryMaps — Esri ArcGIS Online &amp; StoryMaps for visualization. https://www.arcgis.com</w:t>
+      </w:r>
+    </w:p>
+    <w:p>
+      <w:r>
+        <w:t>18. ODK (Open Data Kit) — Offline-capable mobile forms and ecosystem. https://getodk.org</w:t>
+      </w:r>
+    </w:p>
+    <w:p>
+      <w:r>
+        <w:t>19. DataONE — Distributed infrastructure for Earth observational data. https://www.dataone.org</w:t>
+      </w:r>
+    </w:p>
+    <w:p>
+      <w:r>
+        <w:t>20. Zenodo — Open research data repository (DOIs). https://zenodo.org</w:t>
+      </w:r>
+    </w:p>
+    <w:p>
+      <w:r>
+        <w:t>21. Figshare — Research data sharing platform. https://figshare.com</w:t>
+      </w:r>
+    </w:p>
+    <w:p>
+      <w:r>
+        <w:t>22. OpenStreetMap — Community mapping platform and basemap. https://www.openstreetmap.org</w:t>
+      </w:r>
+    </w:p>
+    <w:p>
+      <w:r>
+        <w:t>23. Zooniverse — Citizen science platform for classification &amp; annotation. https://www.zooniverse.org</w:t>
+      </w:r>
+    </w:p>
+    <w:p>
+      <w:r>
+        <w:t>24. Conservation X Labs (CXL) — Innovation hub accelerating conservation tech. https://conservationxlabs.com</w:t>
+      </w:r>
+    </w:p>
+    <w:p>
+      <w:r>
+        <w:t>25. Re:wild — Conservation organization focused on species recovery. https://www.rewild.org</w:t>
+      </w:r>
+    </w:p>
+    <w:p>
+      <w:r>
+        <w:t>Notes: URLs were accessed during draft compilation; some sites apply bot protections or redirects. Include DOIs or archived copies when required for formal citation.</w:t>
       </w:r>
     </w:p>
     <w:p>

</xml_diff>

<commit_message>
Format: add professional cover, concise executive summary and table of contents; improve readability (v1.1)\n\nCo-authored-by: Copilot <223556219+Copilot@users.noreply.github.com>
</commit_message>
<xml_diff>
--- a/OWR _ConsTec _Strategy.docx
+++ b/OWR _ConsTec _Strategy.docx
@@ -58,6 +58,151 @@
       </w:pPr>
       <w:r>
         <w:t>OWR Conservation Technology Strategy (2026–2030)</w:t>
+      </w:r>
+    </w:p>
+    <w:p>
+      <w:r>
+        <w:t>***</w:t>
+      </w:r>
+    </w:p>
+    <w:p>
+      <w:r>
+        <w:t>OWR Conservation Technology Strategy</w:t>
+      </w:r>
+    </w:p>
+    <w:p>
+      <w:r>
+        <w:t>Okapi Wildlife Reserve, Ituri Region — Democratic Republic of the Congo</w:t>
+      </w:r>
+    </w:p>
+    <w:p>
+      <w:r>
+        <w:t>Prepared by: Wildlife Conservation Society (WCS) — Conservation Technology Unit</w:t>
+      </w:r>
+    </w:p>
+    <w:p>
+      <w:r>
+        <w:t>Date: 2026-08-15 | Version: 1.1</w:t>
+      </w:r>
+    </w:p>
+    <w:p>
+      <w:r>
+        <w:t>***</w:t>
+      </w:r>
+    </w:p>
+    <w:p>
+      <w:r>
+        <w:t>Executive Summary</w:t>
+      </w:r>
+    </w:p>
+    <w:p>
+      <w:r>
+        <w:t>This concise strategy outlines a focused, five-year plan (2026–2030) to modernize OWR field operations, close data gaps, and strengthen biodiversity protection using appropriate conservation technologies. Priorities are: (1) digitize patrol reporting and incident response; (2) integrate camera traps, telemetry, acoustic sensors, eDNA, and satellite alerts into a unified ingestion and alerting pipeline; (3) apply AI and remote-sensing automation to reduce data-processing delays; and (4) build local capacity through targeted training and a certified trainer program. Expected outcomes: faster operational response, higher-quality monitoring data, measurable reductions in processing lag, and sustainable local ownership.</w:t>
+      </w:r>
+    </w:p>
+    <w:p>
+      <w:r>
+        <w:t>Key Strategic Outcomes (short)</w:t>
+      </w:r>
+    </w:p>
+    <w:p>
+      <w:r>
+        <w:t>- 100% digital patrol logging and near-real-time CCOPS visibility.</w:t>
+      </w:r>
+    </w:p>
+    <w:p>
+      <w:r>
+        <w:t>- 80% reduction in camera-trap processing time after AI integration.</w:t>
+      </w:r>
+    </w:p>
+    <w:p>
+      <w:r>
+        <w:t>- Rapid detection of canopy loss and illegal activity via automated alerts.</w:t>
+      </w:r>
+    </w:p>
+    <w:p>
+      <w:r>
+        <w:t>- Trained local trainers sustaining operations and maintenance.</w:t>
+      </w:r>
+    </w:p>
+    <w:p>
+      <w:r>
+        <w:t>Table of Contents</w:t>
+      </w:r>
+    </w:p>
+    <w:p>
+      <w:r>
+        <w:t>1. Executive Summary &amp; Strategic Vision</w:t>
+      </w:r>
+    </w:p>
+    <w:p>
+      <w:r>
+        <w:t>2. Baseline Assessment &amp; Operational Context</w:t>
+      </w:r>
+    </w:p>
+    <w:p>
+      <w:r>
+        <w:t>3. Strategic Framework &amp; Technical Architecture</w:t>
+      </w:r>
+    </w:p>
+    <w:p>
+      <w:r>
+        <w:t>4. Core Implementation Pillars</w:t>
+      </w:r>
+    </w:p>
+    <w:p>
+      <w:r>
+        <w:t xml:space="preserve">   4.1 Patrolling &amp; Law Enforcement Monitoring (LEM)</w:t>
+      </w:r>
+    </w:p>
+    <w:p>
+      <w:r>
+        <w:t xml:space="preserve">   4.2 Ecological &amp; Environmental Monitoring</w:t>
+      </w:r>
+    </w:p>
+    <w:p>
+      <w:r>
+        <w:t xml:space="preserve">   4.3 Conservation Social Science &amp; Safeguarding</w:t>
+      </w:r>
+    </w:p>
+    <w:p>
+      <w:r>
+        <w:t xml:space="preserve">   4.4 Data Science, Cartography &amp; Impact Dashboards</w:t>
+      </w:r>
+    </w:p>
+    <w:p>
+      <w:r>
+        <w:t>5. Hardware, Sensors &amp; Integration Architecture</w:t>
+      </w:r>
+    </w:p>
+    <w:p>
+      <w:r>
+        <w:t>6. Technical Support Structure &amp; Technical Forums</w:t>
+      </w:r>
+    </w:p>
+    <w:p>
+      <w:r>
+        <w:t>7. Phased Implementation Roadmap (2026–2028)</w:t>
+      </w:r>
+    </w:p>
+    <w:p>
+      <w:r>
+        <w:t>8. Training Plan &amp; Capacity Building</w:t>
+      </w:r>
+    </w:p>
+    <w:p>
+      <w:r>
+        <w:t>9. References</w:t>
+      </w:r>
+    </w:p>
+    <w:p>
+      <w:r>
+        <w:t>10. Annexes (Budget outline, Hardware lists, SOPs)</w:t>
+      </w:r>
+    </w:p>
+    <w:p>
+      <w:r>
+        <w:t>---</w:t>
       </w:r>
     </w:p>
     <w:p>

</xml_diff>

<commit_message>
Integrate RFO Data Protocol summary into strategy (Annex A); prepare for drone protocol integration\n\nCo-authored-by: Copilot <223556219+Copilot@users.noreply.github.com>
</commit_message>
<xml_diff>
--- a/OWR _ConsTec _Strategy.docx
+++ b/OWR _ConsTec _Strategy.docx
@@ -983,6 +983,229 @@
     <w:p>
       <w:r>
         <w:t>- Optionally commit the new DOCX to the repo and include a commit message describing the update.</w:t>
+      </w:r>
+    </w:p>
+    <w:p>
+      <w:pPr>
+        <w:pStyle w:val="Heading2"/>
+      </w:pPr>
+      <w:r>
+        <w:t>Annex A: Integrated RFO Data Protocol (summary)</w:t>
+      </w:r>
+    </w:p>
+    <w:p>
+      <w:r>
+        <w:t>This annex synthesizes key elements from the RFO "DATA PROTOCOL" (Draft) found in the OWR repository. It formalizes data handling expectations across collection, processing, quality control, storage, visualization, and sharing.</w:t>
+      </w:r>
+    </w:p>
+    <w:p>
+      <w:r>
+        <w:t>A.1 Purpose &amp; Scope</w:t>
+      </w:r>
+    </w:p>
+    <w:p>
+      <w:r>
+        <w:t>- Formalize how WCS/OWR collects, manages, analyzes, and publishes program data to ensure confidentiality, integrity, and usability for decision-making and reporting.</w:t>
+      </w:r>
+    </w:p>
+    <w:p>
+      <w:r>
+        <w:t>- Applies to operational (patrols, incidents), ecological (camera traps, acoustic, eDNA), social science (Kobo/household surveys) and remote-sensing datasets produced by OWR programs.</w:t>
+      </w:r>
+    </w:p>
+    <w:p>
+      <w:r>
+        <w:t>A.2 Key Roles &amp; Responsibilities</w:t>
+      </w:r>
+    </w:p>
+    <w:p>
+      <w:r>
+        <w:t>- MEAL Team / Data Manager: primary custodians for data ingestion, cleaning, validation, and archiving.</w:t>
+      </w:r>
+    </w:p>
+    <w:p>
+      <w:r>
+        <w:t>- Database/IT: platform administration, access control, and backups.</w:t>
+      </w:r>
+    </w:p>
+    <w:p>
+      <w:r>
+        <w:t>- Program Leads: dataset owners who approve dataset release and use.</w:t>
+      </w:r>
+    </w:p>
+    <w:p>
+      <w:r>
+        <w:t>- CCOPS / Conservation Tech: responsible for operational sensor feeds, EarthRanger integrations, and near-real-time alerts.</w:t>
+      </w:r>
+    </w:p>
+    <w:p>
+      <w:r>
+        <w:t>A.3 Data Collection &amp; Tools</w:t>
+      </w:r>
+    </w:p>
+    <w:p>
+      <w:r>
+        <w:t>- Approved collection tools: Kobo Collect (surveys), SMART/CyberTracker (patrols/LEM), Garmin/telemetry (tracking), camera trap platforms, acoustic recorders, eDNA sampling kits.</w:t>
+      </w:r>
+    </w:p>
+    <w:p>
+      <w:r>
+        <w:t>- Use coded Unique Identifier Codes (UICs) for sensitive social data to separate personal identifiers from research datasets and protect confidentiality.</w:t>
+      </w:r>
+    </w:p>
+    <w:p>
+      <w:r>
+        <w:t>- Recording: obtain consent for interviews/FGDs; audio recordings transcribed then deleted after transcription per the protocol.</w:t>
+      </w:r>
+    </w:p>
+    <w:p>
+      <w:r>
+        <w:t>A.4 Data Flow &amp; Ingestion</w:t>
+      </w:r>
+    </w:p>
+    <w:p>
+      <w:r>
+        <w:t>- Primary ingestion pipeline: field tools → secure upload (Kobo/SMART/Device sync) → centralized staging (SharePoint / WCS-hosted DB) → cleaning/validation → approved clean datasets exported to analysis and dashboards (PowerBI, EarthRanger, StoryMaps).</w:t>
+      </w:r>
+    </w:p>
+    <w:p>
+      <w:r>
+        <w:t>- For sensor data (camera traps, telemetry, acoustic): follow established ingestion routes into Wildlife Insights / EarthRanger / Gundi middleware for real-time or batched handling.</w:t>
+      </w:r>
+    </w:p>
+    <w:p>
+      <w:r>
+        <w:t>A.5 Metadata, Formats &amp; Standards</w:t>
+      </w:r>
+    </w:p>
+    <w:p>
+      <w:r>
+        <w:t>- Capture metadata automatically where possible (device ID, start/end timestamps, GPS, operator ID).</w:t>
+      </w:r>
+    </w:p>
+    <w:p>
+      <w:r>
+        <w:t>- Use standard export formats: CSV, XLSX, GeoJSON/Shapefiles for geodata, JSON/XML for APIs. Follow TDWG and other biodiversity metadata conventions where relevant.</w:t>
+      </w:r>
+    </w:p>
+    <w:p>
+      <w:r>
+        <w:t>A.6 Data Processing &amp; Deliverables</w:t>
+      </w:r>
+    </w:p>
+    <w:p>
+      <w:r>
+        <w:t>- Data processing steps: initial QC, standard cleaning scripts, metadata enrichment, analysis-ready exports.</w:t>
+      </w:r>
+    </w:p>
+    <w:p>
+      <w:r>
+        <w:t>- Expected deliverables: cleaned datasets, PowerBI/Impact dashboards, SMART reports, NRGT site reports, and periodic Data Audit Reports.</w:t>
+      </w:r>
+    </w:p>
+    <w:p>
+      <w:r>
+        <w:t>- Estimated data volumes: plan for monthly volumes (50–1000 MB) depending on sensor deployments.</w:t>
+      </w:r>
+    </w:p>
+    <w:p>
+      <w:r>
+        <w:t>A.7 Data Quality &amp; Review</w:t>
+      </w:r>
+    </w:p>
+    <w:p>
+      <w:r>
+        <w:t>- Implement Data Audit Forms (DAF) and quarterly Data Quality Audit Reports summarizing problems, corrective actions, responsible staff, and timelines.</w:t>
+      </w:r>
+    </w:p>
+    <w:p>
+      <w:r>
+        <w:t>- Core QC checks: completeness, conformity, consistency, accuracy, eligibility.</w:t>
+      </w:r>
+    </w:p>
+    <w:p>
+      <w:r>
+        <w:t>A.8 Storage, Archiving &amp; Preservation</w:t>
+      </w:r>
+    </w:p>
+    <w:p>
+      <w:r>
+        <w:t>- Raw and cleaned data stored with role-based access on SharePoint / WCS-hosted storage; archived copies retained according to project retention schedules.</w:t>
+      </w:r>
+    </w:p>
+    <w:p>
+      <w:r>
+        <w:t>- Identify datasets for destruction and assign an archiving steward responsible for long-term preservation.</w:t>
+      </w:r>
+    </w:p>
+    <w:p>
+      <w:r>
+        <w:t>A.9 Data Sharing &amp; Diffusion</w:t>
+      </w:r>
+    </w:p>
+    <w:p>
+      <w:r>
+        <w:t>- During project: controlled sharing among WCS project teams for analysis and operational response.</w:t>
+      </w:r>
+    </w:p>
+    <w:p>
+      <w:r>
+        <w:t>- After project: publish non-sensitive datasets to public repositories (Zenodo, Figshare, GBIF where appropriate) with DOIs and clear licensing; sensitive data withheld or shared under data-sharing agreements.</w:t>
+      </w:r>
+    </w:p>
+    <w:p>
+      <w:r>
+        <w:t>A.10 Visualization &amp; Reporting</w:t>
+      </w:r>
+    </w:p>
+    <w:p>
+      <w:r>
+        <w:t>- Use PowerBI, ArcGIS StoryMaps, and the WCS Impact Dashboard for internal and external reporting.</w:t>
+      </w:r>
+    </w:p>
+    <w:p>
+      <w:r>
+        <w:t>- Define update frequency and dashboard roles (editors/viewers) and align data refresh schedules with ingestion cadence.</w:t>
+      </w:r>
+    </w:p>
+    <w:p>
+      <w:r>
+        <w:t>A.11 Update Frequency &amp; Governance</w:t>
+      </w:r>
+    </w:p>
+    <w:p>
+      <w:r>
+        <w:t>- Review and update the Data Protocol annually or when major technical/operational changes occur.</w:t>
+      </w:r>
+    </w:p>
+    <w:p>
+      <w:r>
+        <w:t>- Maintain a change log and dataset registry documenting versions, stewards, and access rules.</w:t>
+      </w:r>
+    </w:p>
+    <w:p>
+      <w:r>
+        <w:t>A.12 Next steps for technical integration</w:t>
+      </w:r>
+    </w:p>
+    <w:p>
+      <w:r>
+        <w:t>- Incorporate RFO protocol metadata and DAF templates into the OWR Data Governance folder.</w:t>
+      </w:r>
+    </w:p>
+    <w:p>
+      <w:r>
+        <w:t>- Automate ingestion pipelines for Kobo, SMART, and camera-trap exports; connect to Gundi/EarthRanger where applicable.</w:t>
+      </w:r>
+    </w:p>
+    <w:p>
+      <w:r>
+        <w:t>- Schedule MEAL–ConservationTech joint workshops to operationalize QC checks, DAF usage, and archiving responsibilities.</w:t>
+      </w:r>
+    </w:p>
+    <w:p>
+      <w:r>
+        <w:t>---</w:t>
       </w:r>
     </w:p>
     <w:p>

</xml_diff>

<commit_message>
Integrate RFO research strategy and drone protocol highlights (Annex A & B); update training and SOP alignment\n\nCo-authored-by: Copilot <223556219+Copilot@users.noreply.github.com>
</commit_message>
<xml_diff>
--- a/OWR _ConsTec _Strategy.docx
+++ b/OWR _ConsTec _Strategy.docx
@@ -1201,6 +1201,174 @@
     <w:p>
       <w:r>
         <w:t>- Schedule MEAL–ConservationTech joint workshops to operationalize QC checks, DAF usage, and archiving responsibilities.</w:t>
+      </w:r>
+    </w:p>
+    <w:p>
+      <w:r>
+        <w:t>---</w:t>
+      </w:r>
+    </w:p>
+    <w:p>
+      <w:pPr>
+        <w:pStyle w:val="Heading2"/>
+      </w:pPr>
+      <w:r>
+        <w:t>Annex B: Drone Protocol (RFO) — key points</w:t>
+      </w:r>
+    </w:p>
+    <w:p>
+      <w:r>
+        <w:t>This annex summarizes operational and ethical guidance from the Protocole Drone RFO (DRAFT V4) to ensure safe, secure, and scientifically rigorous drone deployments across OWR.</w:t>
+      </w:r>
+    </w:p>
+    <w:p>
+      <w:r>
+        <w:t>B.1 Purpose &amp; Role</w:t>
+      </w:r>
+    </w:p>
+    <w:p>
+      <w:r>
+        <w:t>- Drones are deployed for tactical reconnaissance, biosurveillance, habitat mapping, and to reduce risk to ground teams in insecure areas; mission types include species counts, thermal surveys, deforestation mapping, and patrol support.</w:t>
+      </w:r>
+    </w:p>
+    <w:p>
+      <w:r>
+        <w:t>B.2 Operating Principles</w:t>
+      </w:r>
+    </w:p>
+    <w:p>
+      <w:r>
+        <w:t>- Conform to ICCN and CCOPS-RFO security directives; minimize disturbance to wildlife and communities; apply One Health and ethical considerations in mission design.</w:t>
+      </w:r>
+    </w:p>
+    <w:p>
+      <w:r>
+        <w:t>- Use appropriate sensors (thermal radiometric, multispectral/optical) matched to objectives; prioritize minimal-visibility flight profiles.</w:t>
+      </w:r>
+    </w:p>
+    <w:p>
+      <w:r>
+        <w:t>B.3 Mission Planning (POP)</w:t>
+      </w:r>
+    </w:p>
+    <w:p>
+      <w:r>
+        <w:t>- Define objectives, select payload, obtain clearances, design routes avoiding sensitive zones, and set emergency retraction/exfiltration plans.</w:t>
+      </w:r>
+    </w:p>
+    <w:p>
+      <w:r>
+        <w:t>- Pre-flight checks: battery thresholds (min 80%), sensor calibration, SD card formatting (U3), telemetry verification.</w:t>
+      </w:r>
+    </w:p>
+    <w:p>
+      <w:r>
+        <w:t>B.4 Flight Parameters &amp; Safety</w:t>
+      </w:r>
+    </w:p>
+    <w:p>
+      <w:r>
+        <w:t>- Altitude: 50–120 m recommended; maintain VLOS with pilot/observer; avoid flights in heavy precipitation or winds &gt;35 km/h.</w:t>
+      </w:r>
+    </w:p>
+    <w:p>
+      <w:r>
+        <w:t>- Satellite/GPS minimum: 12 satellites; battery rule of thirds for safe return.</w:t>
+      </w:r>
+    </w:p>
+    <w:p>
+      <w:r>
+        <w:t>B.5 Roles &amp; Organization</w:t>
+      </w:r>
+    </w:p>
+    <w:p>
+      <w:r>
+        <w:t>- Unit Lead: mission approval and liaison with CCOPS.</w:t>
+      </w:r>
+    </w:p>
+    <w:p>
+      <w:r>
+        <w:t>- Pilot (certified): aircraft operation and safety.</w:t>
+      </w:r>
+    </w:p>
+    <w:p>
+      <w:r>
+        <w:t>- Visual Observer: airspace/ground safety and radio comms.</w:t>
+      </w:r>
+    </w:p>
+    <w:p>
+      <w:r>
+        <w:t>- Data Steward (GIS/Analyst): secure retrieval, QA, encryption, and archiving.</w:t>
+      </w:r>
+    </w:p>
+    <w:p>
+      <w:r>
+        <w:t>B.6 Data Handling &amp; Security</w:t>
+      </w:r>
+    </w:p>
+    <w:p>
+      <w:r>
+        <w:t>- Immediate post-mission: decrypt/sanitize, transfer to encrypted server, and log mission metadata (timestamps, coordinates, sensor settings, incidents) in Operations Journal.</w:t>
+      </w:r>
+    </w:p>
+    <w:p>
+      <w:r>
+        <w:t>- Restrict publication/sharing of precise species/locality coordinates; anonymize or aggregate sensitive locations before external release.</w:t>
+      </w:r>
+    </w:p>
+    <w:p>
+      <w:r>
+        <w:t>- Store media in secure, climate-controlled storage; enforce encryption on portable media.</w:t>
+      </w:r>
+    </w:p>
+    <w:p>
+      <w:r>
+        <w:t>B.7 Ethical &amp; Community Considerations</w:t>
+      </w:r>
+    </w:p>
+    <w:p>
+      <w:r>
+        <w:t>- Never image civilians or Indigenous peoples without consent; avoid sacred/cultural sites; pause flights if community disturbance is detected.</w:t>
+      </w:r>
+    </w:p>
+    <w:p>
+      <w:r>
+        <w:t>B.8 Maintenance &amp; Logistics</w:t>
+      </w:r>
+    </w:p>
+    <w:p>
+      <w:r>
+        <w:t>- Climate-aware battery care (avoid storage &gt;48h at full charge in high heat/humidity); use Pelican cases and desiccants; follow LiPo safety protocols.</w:t>
+      </w:r>
+    </w:p>
+    <w:p>
+      <w:r>
+        <w:t>B.9 Incident Management</w:t>
+      </w:r>
+    </w:p>
+    <w:p>
+      <w:r>
+        <w:t>- Record GPS last-known for crashes; prioritize team safety in recovery; if drone compromised by hostiles, do not attempt risky retrieval.</w:t>
+      </w:r>
+    </w:p>
+    <w:p>
+      <w:r>
+        <w:t>- Document cybersecurity incidents and switch to manual/ATTI mode if anomalous behavior detected.</w:t>
+      </w:r>
+    </w:p>
+    <w:p>
+      <w:r>
+        <w:t>B.10 Training Implications</w:t>
+      </w:r>
+    </w:p>
+    <w:p>
+      <w:r>
+        <w:t>- Integrate drone SOPs into training modules: pre-flight checks, mission planning, ethics, emergency response, data security, maintenance, and post-mission processing.</w:t>
+      </w:r>
+    </w:p>
+    <w:p>
+      <w:r>
+        <w:t>- Certify a cadre of pilots, observers, and data stewards as part of the Train-the-Trainer program.</w:t>
       </w:r>
     </w:p>
     <w:p>

</xml_diff>